<commit_message>
Orga: Protokoll, Planung und Projekt-Schnittstellen hinzugefügt
</commit_message>
<xml_diff>
--- a/Projektplanung/Aufgabenstellung.docx
+++ b/Projektplanung/Aufgabenstellung.docx
@@ -4,15 +4,7 @@
   <w:body>
     <w:p>
       <w:r>
-        <w:t xml:space="preserve">(Fourier) </w:t>
-      </w:r>
-      <w:proofErr w:type="spellStart"/>
-      <w:r>
-        <w:t>Neural</w:t>
-      </w:r>
-      <w:proofErr w:type="spellEnd"/>
-      <w:r>
-        <w:t xml:space="preserve"> Operator programmieren</w:t>
+        <w:t>(Fourier) Neural Operator programmieren</w:t>
       </w:r>
     </w:p>
     <w:p>
@@ -27,15 +19,7 @@
     </w:p>
     <w:p>
       <w:r>
-        <w:t xml:space="preserve">Und nicht ASTRA/ </w:t>
-      </w:r>
-      <w:proofErr w:type="spellStart"/>
-      <w:r>
-        <w:t>Ocelot</w:t>
-      </w:r>
-      <w:proofErr w:type="spellEnd"/>
-      <w:r>
-        <w:t xml:space="preserve"> oder andere Simulationsumgebungen, die zusätzlichen Einarbeitungs- und Nutzungsaufwand bedeuten würden</w:t>
+        <w:t>Und nicht ASTRA/ Ocelot oder andere Simulationsumgebungen, die zusätzlichen Einarbeitungs- und Nutzungsaufwand bedeuten würden</w:t>
       </w:r>
     </w:p>
     <w:p>
@@ -55,15 +39,7 @@
     </w:p>
     <w:p>
       <w:r>
-        <w:t xml:space="preserve">Letzteres besser, da bereits Testergebnisse von </w:t>
-      </w:r>
-      <w:proofErr w:type="spellStart"/>
-      <w:r>
-        <w:t>Dhamrait</w:t>
-      </w:r>
-      <w:proofErr w:type="spellEnd"/>
-      <w:r>
-        <w:t xml:space="preserve"> vorliegen zur Gegenüberstellung</w:t>
+        <w:t>Letzteres besser, da bereits Testergebnisse von Dhamrait vorliegen zur Gegenüberstellung</w:t>
       </w:r>
     </w:p>
     <w:p>
@@ -102,7 +78,7 @@
           <w:i/>
           <w:iCs/>
         </w:rPr>
-        <w:t xml:space="preserve">Neural-Operator-Surrogate für </w:t>
+        <w:t xml:space="preserve">Neural-Surrogate für </w:t>
       </w:r>
       <w:r>
         <w:rPr>
@@ -166,30 +142,14 @@
         <w:t xml:space="preserve"> wird der </w:t>
       </w:r>
       <w:r>
-        <w:t>bestehende Feldlöser _</w:t>
-      </w:r>
-      <w:proofErr w:type="spellStart"/>
-      <w:r>
-        <w:t>integrated_green_</w:t>
-      </w:r>
-      <w:proofErr w:type="gramStart"/>
-      <w:r>
-        <w:t>function</w:t>
-      </w:r>
-      <w:proofErr w:type="spellEnd"/>
+        <w:t xml:space="preserve">bestehende Feldlöser _integrated_green_function() (IGF) </w:t>
+      </w:r>
+      <w:r>
+        <w:t xml:space="preserve">durch einen </w:t>
+      </w:r>
       <w:r>
         <w:t>(</w:t>
       </w:r>
-      <w:proofErr w:type="gramEnd"/>
-      <w:r>
-        <w:t xml:space="preserve">) (IGF) </w:t>
-      </w:r>
-      <w:r>
-        <w:t xml:space="preserve">durch einen </w:t>
-      </w:r>
-      <w:r>
-        <w:t>(</w:t>
-      </w:r>
       <w:r>
         <w:t>Fourier</w:t>
       </w:r>
@@ -197,15 +157,7 @@
         <w:t>)</w:t>
       </w:r>
       <w:r>
-        <w:t xml:space="preserve"> </w:t>
-      </w:r>
-      <w:proofErr w:type="spellStart"/>
-      <w:r>
-        <w:t>Neural</w:t>
-      </w:r>
-      <w:proofErr w:type="spellEnd"/>
-      <w:r>
-        <w:t xml:space="preserve"> Operator abgelöst </w:t>
+        <w:t xml:space="preserve"> Neural Operator abgelöst </w:t>
       </w:r>
       <w:r>
         <w:t xml:space="preserve">und </w:t>
@@ -223,15 +175,7 @@
         <w:t xml:space="preserve"> Rückwärtsdifferentiation</w:t>
       </w:r>
       <w:r>
-        <w:t xml:space="preserve">, wie in </w:t>
-      </w:r>
-      <w:proofErr w:type="spellStart"/>
-      <w:r>
-        <w:t>Dhamrait</w:t>
-      </w:r>
-      <w:proofErr w:type="spellEnd"/>
-      <w:r>
-        <w:t xml:space="preserve"> et al.)</w:t>
+        <w:t>, wie in Dhamrait et al.)</w:t>
       </w:r>
       <w:r>
         <w:t>.</w:t>
@@ -256,29 +200,8 @@
           <w:iCs/>
         </w:rPr>
       </w:pPr>
-      <w:proofErr w:type="spellStart"/>
-      <w:r>
-        <w:t>Neural</w:t>
-      </w:r>
-      <w:proofErr w:type="spellEnd"/>
-      <w:r>
-        <w:t xml:space="preserve"> Operator Surrogate ähnlich zu </w:t>
-      </w:r>
-      <w:proofErr w:type="spellStart"/>
-      <w:r>
-        <w:t>Neural</w:t>
-      </w:r>
-      <w:proofErr w:type="spellEnd"/>
-      <w:r>
-        <w:t xml:space="preserve"> Network Surrogate, dass in </w:t>
-      </w:r>
-      <w:proofErr w:type="spellStart"/>
-      <w:r>
-        <w:t>doi</w:t>
-      </w:r>
-      <w:proofErr w:type="spellEnd"/>
-      <w:r>
-        <w:t>:</w:t>
+      <w:r>
+        <w:t>Neural Operator Surrogate ähnlich zu Neural Network Surrogate, dass in doi:</w:t>
       </w:r>
       <w:r>
         <w:rPr>
@@ -372,15 +295,7 @@
         </w:rPr>
       </w:pPr>
       <w:r>
-        <w:t xml:space="preserve">Welche Funktionen soll der </w:t>
-      </w:r>
-      <w:proofErr w:type="spellStart"/>
-      <w:r>
-        <w:t>Neural</w:t>
-      </w:r>
-      <w:proofErr w:type="spellEnd"/>
-      <w:r>
-        <w:t xml:space="preserve"> Operator ausgeben (und somit ersetzen) können?</w:t>
+        <w:t>Welche Funktionen soll der Neural Operator ausgeben (und somit ersetzen) können?</w:t>
       </w:r>
     </w:p>
     <w:p>
@@ -426,40 +341,11 @@
       </w:pPr>
       <w:r>
         <w:lastRenderedPageBreak/>
-        <w:t xml:space="preserve">Ist der </w:t>
-      </w:r>
-      <w:proofErr w:type="spellStart"/>
-      <w:r>
-        <w:t>neural</w:t>
-      </w:r>
-      <w:proofErr w:type="spellEnd"/>
-      <w:r>
-        <w:t xml:space="preserve"> Operator ohnehin an das Vorgehen für das </w:t>
-      </w:r>
-      <w:proofErr w:type="spellStart"/>
-      <w:r>
-        <w:t>Neural</w:t>
-      </w:r>
-      <w:proofErr w:type="spellEnd"/>
-      <w:r>
-        <w:t xml:space="preserve"> Network </w:t>
-      </w:r>
-      <w:proofErr w:type="spellStart"/>
-      <w:r>
-        <w:t>surrogate</w:t>
-      </w:r>
-      <w:proofErr w:type="spellEnd"/>
-      <w:r>
-        <w:t xml:space="preserve"> zu orientieren, sodass</w:t>
-      </w:r>
-      <w:r>
-        <w:t xml:space="preserve"> Option 2 schon implizit in Option 1 enthalten </w:t>
-      </w:r>
-      <w:proofErr w:type="gramStart"/>
-      <w:r>
-        <w:t>ist?`</w:t>
-      </w:r>
-      <w:proofErr w:type="gramEnd"/>
+        <w:t>Ist der neural Operator ohnehin an das Vorgehen für das Neural Network surrogate zu orientieren, sodass</w:t>
+      </w:r>
+      <w:r>
+        <w:t xml:space="preserve"> Option 2 schon implizit in Option 1 enthalten ist?`</w:t>
+      </w:r>
     </w:p>
     <w:p>
       <w:pPr>
@@ -473,45 +359,11 @@
         </w:rPr>
       </w:pPr>
       <w:r>
-        <w:t xml:space="preserve">Wo kommen die Methoden und Klassen aus </w:t>
-      </w:r>
-      <w:proofErr w:type="spellStart"/>
-      <w:r>
-        <w:t>cheetah</w:t>
-      </w:r>
-      <w:proofErr w:type="spellEnd"/>
-      <w:r>
-        <w:t xml:space="preserve"> im </w:t>
-      </w:r>
-      <w:proofErr w:type="spellStart"/>
-      <w:r>
-        <w:t>Neural</w:t>
-      </w:r>
-      <w:proofErr w:type="spellEnd"/>
-      <w:r>
-        <w:t xml:space="preserve"> Network </w:t>
-      </w:r>
-      <w:proofErr w:type="spellStart"/>
-      <w:r>
-        <w:t>surrogate</w:t>
-      </w:r>
-      <w:proofErr w:type="spellEnd"/>
-      <w:r>
-        <w:t xml:space="preserve"> zum Einsatz? Ich konnte in den Dateien der </w:t>
-      </w:r>
-      <w:proofErr w:type="spellStart"/>
-      <w:r>
-        <w:t>cheetah</w:t>
-      </w:r>
-      <w:proofErr w:type="spellEnd"/>
-      <w:r>
-        <w:t xml:space="preserve">-demo </w:t>
-      </w:r>
-      <w:proofErr w:type="spellStart"/>
+        <w:t xml:space="preserve">Wo kommen die Methoden und Klassen aus cheetah im Neural Network surrogate zum Einsatz? Ich konnte in den Dateien der cheetah-demo </w:t>
+      </w:r>
       <w:r>
         <w:t>neural_network_space_charge_quad</w:t>
       </w:r>
-      <w:proofErr w:type="spellEnd"/>
       <w:r>
         <w:t xml:space="preserve"> (</w:t>
       </w:r>
@@ -534,23 +386,7 @@
         </w:rPr>
       </w:pPr>
       <w:r>
-        <w:t xml:space="preserve">Oder ist es umgekehrt so, dass das </w:t>
-      </w:r>
-      <w:proofErr w:type="spellStart"/>
-      <w:r>
-        <w:t>surrogate</w:t>
-      </w:r>
-      <w:proofErr w:type="spellEnd"/>
-      <w:r>
-        <w:t xml:space="preserve"> erst in einer „</w:t>
-      </w:r>
-      <w:proofErr w:type="spellStart"/>
-      <w:r>
-        <w:t>cheetah</w:t>
-      </w:r>
-      <w:proofErr w:type="spellEnd"/>
-      <w:r>
-        <w:t>-Simulationskette“ (also Anordnung von Cheetah-Elementen, damit diese mit Cheetah-Methoden berechnet werden) integriert wird?</w:t>
+        <w:t>Oder ist es umgekehrt so, dass das surrogate erst in einer „cheetah-Simulationskette“ (also Anordnung von Cheetah-Elementen, damit diese mit Cheetah-Methoden berechnet werden) integriert wird?</w:t>
       </w:r>
     </w:p>
     <w:bookmarkEnd w:id="0"/>
@@ -1289,6 +1125,7 @@
   <w:style w:type="character" w:default="1" w:styleId="Absatz-Standardschriftart">
     <w:name w:val="Default Paragraph Font"/>
     <w:uiPriority w:val="1"/>
+    <w:semiHidden/>
     <w:unhideWhenUsed/>
   </w:style>
   <w:style w:type="table" w:default="1" w:styleId="NormaleTabelle">

</xml_diff>